<commit_message>
docs: recap + guide synchro maison 17/07 (soft skills, niveau 0/1, commandes migration)
Co-Authored-By: Claude Opus 4.8 <noreply@anthropic.com>
</commit_message>
<xml_diff>
--- a/Guide-Sync-Maison-2026-07-17.docx
+++ b/Guide-Sync-Maison-2026-07-17.docx
@@ -37,109 +37,143 @@
         <w:pStyle w:val="Heading1"/>
       </w:pPr>
       <w:r>
-        <w:t xml:space="preserve">1. Ce qui a changé aujourd'hui</w:t>
-      </w:r>
-    </w:p>
-    <w:p>
-      <w:pPr>
-        <w:pStyle w:val="Bullet"/>
-      </w:pPr>
-      <w:r>
-        <w:t xml:space="preserve">•  </w:t>
-      </w:r>
-      <w:r>
-        <w:rPr>
-          <w:b/>
-        </w:rPr>
-        <w:t xml:space="preserve">Ajout d'un candidat — import du CV : </w:t>
-      </w:r>
-      <w:r>
-        <w:t xml:space="preserve">dans l'onglet « Candidats », le bouton « Ajouter un candidat » propose désormais un bouton « Importer » au-dessus du champ CV. On peut y déposer un fichier PDF ou une image (JPG/PNG), comme sur la page publique /postuler. Le texte du CV est extrait automatiquement et rempli dans le champ.</w:t>
-      </w:r>
-    </w:p>
-    <w:p>
-      <w:pPr>
-        <w:pStyle w:val="Bullet"/>
-      </w:pPr>
-      <w:r>
-        <w:t xml:space="preserve">•  </w:t>
-      </w:r>
-      <w:r>
-        <w:rPr>
-          <w:b/>
-        </w:rPr>
-        <w:t xml:space="preserve">Ajout d'un candidat — import de la lettre : </w:t>
-      </w:r>
-      <w:r>
-        <w:t xml:space="preserve">de la même façon, un bouton « Importer » au-dessus du champ « Lettre de motivation » accepte un fichier PDF ou Word (.docx). Le texte est extrait et rempli automatiquement.</w:t>
-      </w:r>
-    </w:p>
-    <w:p>
-      <w:pPr>
-        <w:pStyle w:val="Bullet"/>
-      </w:pPr>
-      <w:r>
-        <w:t xml:space="preserve">•  </w:t>
-      </w:r>
-      <w:r>
-        <w:rPr>
-          <w:b/>
-        </w:rPr>
-        <w:t xml:space="preserve">Champs toujours éditables : </w:t>
-      </w:r>
-      <w:r>
-        <w:t xml:space="preserve">après import, le texte extrait apparaît dans la zone de saisie et reste modifiable ; on peut aussi continuer à coller le texte à la main comme avant.</w:t>
-      </w:r>
-    </w:p>
-    <w:p>
-      <w:pPr>
-        <w:pStyle w:val="Bullet"/>
-      </w:pPr>
-      <w:r>
-        <w:t xml:space="preserve">•  </w:t>
-      </w:r>
-      <w:r>
-        <w:rPr>
-          <w:b/>
-        </w:rPr>
-        <w:t xml:space="preserve">OCR des images réutilisé : </w:t>
-      </w:r>
-      <w:r>
-        <w:t xml:space="preserve">la lecture d'un CV en image passe par l'IA Gemini (déjà en place) ; PDF via pdf-parse et Word via mammoth. Aucune nouvelle bibliothèque.</w:t>
-      </w:r>
-    </w:p>
-    <w:p>
-      <w:pPr>
-        <w:pStyle w:val="Bullet"/>
-      </w:pPr>
-      <w:r>
-        <w:t xml:space="preserve">•  </w:t>
-      </w:r>
-      <w:r>
-        <w:rPr>
-          <w:b/>
-        </w:rPr>
-        <w:t xml:space="preserve">Côté serveur : </w:t>
-      </w:r>
-      <w:r>
-        <w:t xml:space="preserve">nouvel endpoint POST /api/extract-text (authentifié) qui extrait le texte d'un fichier « à la volée », sans qu'un candidat existe déjà.</w:t>
-      </w:r>
-    </w:p>
-    <w:p>
-      <w:pPr>
-        <w:pStyle w:val="Bullet"/>
-      </w:pPr>
-      <w:r>
-        <w:t xml:space="preserve">•  </w:t>
-      </w:r>
-      <w:r>
-        <w:rPr>
-          <w:b/>
-        </w:rPr>
-        <w:t xml:space="preserve">Aucun changement de base : </w:t>
-      </w:r>
-      <w:r>
-        <w:t xml:space="preserve">pas de nouvelle migration, seed inchangé, aucune nouvelle dépendance.</w:t>
+        <w:t xml:space="preserve">1. Ce qui a changé aujourd'hui (17/07)</w:t>
+      </w:r>
+    </w:p>
+    <w:p>
+      <w:pPr>
+        <w:pStyle w:val="Bullet"/>
+      </w:pPr>
+      <w:r>
+        <w:t xml:space="preserve">•  </w:t>
+      </w:r>
+      <w:r>
+        <w:rPr>
+          <w:b/>
+        </w:rPr>
+        <w:t xml:space="preserve">Import CV / lettre à l'ajout d'un candidat : </w:t>
+      </w:r>
+      <w:r>
+        <w:t xml:space="preserve">dans « Candidats » → « Ajouter un candidat », un bouton « Importer » au-dessus des champs CV (PDF ou image) et Lettre (PDF ou Word) extrait le texte automatiquement, comme sur /postuler. Le texte reste éditable.</w:t>
+      </w:r>
+    </w:p>
+    <w:p>
+      <w:pPr>
+        <w:pStyle w:val="Bullet"/>
+      </w:pPr>
+      <w:r>
+        <w:t xml:space="preserve">•  </w:t>
+      </w:r>
+      <w:r>
+        <w:rPr>
+          <w:b/>
+        </w:rPr>
+        <w:t xml:space="preserve">Soft skills sur les offres : </w:t>
+      </w:r>
+      <w:r>
+        <w:t xml:space="preserve">nouveau champ « Soft skills souhaités » à la création/édition d'une offre. Affichés dans la liste des offres (badges fond noir / texte blanc) et dans le détail. Ils sont aussi transmis à l'analyse IA (le score « savoir-être » est évalué en regard des attentes du poste).</w:t>
+      </w:r>
+    </w:p>
+    <w:p>
+      <w:pPr>
+        <w:pStyle w:val="Bullet"/>
+      </w:pPr>
+      <w:r>
+        <w:t xml:space="preserve">•  </w:t>
+      </w:r>
+      <w:r>
+        <w:rPr>
+          <w:b/>
+        </w:rPr>
+        <w:t xml:space="preserve">Soft skills sur la fiche candidat : </w:t>
+      </w:r>
+      <w:r>
+        <w:t xml:space="preserve">nouveau bloc « Savoir-être (soft skills) » dans l'onglet Analyse IA (ces compétences étaient extraites par l'IA mais jamais affichées).</w:t>
+      </w:r>
+    </w:p>
+    <w:p>
+      <w:pPr>
+        <w:pStyle w:val="Bullet"/>
+      </w:pPr>
+      <w:r>
+        <w:t xml:space="preserve">•  </w:t>
+      </w:r>
+      <w:r>
+        <w:rPr>
+          <w:b/>
+        </w:rPr>
+        <w:t xml:space="preserve">Recherche candidats côté serveur : </w:t>
+      </w:r>
+      <w:r>
+        <w:t xml:space="preserve">la barre de recherche porte désormais sur TOUTE la base (nom / email / téléphone / localisation), plus seulement sur la page affichée.</w:t>
+      </w:r>
+    </w:p>
+    <w:p>
+      <w:pPr>
+        <w:pStyle w:val="Bullet"/>
+      </w:pPr>
+      <w:r>
+        <w:t xml:space="preserve">•  </w:t>
+      </w:r>
+      <w:r>
+        <w:rPr>
+          <w:b/>
+        </w:rPr>
+        <w:t xml:space="preserve">Composant Button réutilisable : </w:t>
+      </w:r>
+      <w:r>
+        <w:t xml:space="preserve">nouveau src/components/Button.tsx (un seul endroit pour le style des boutons). Premier écran migré : « Candidats ».</w:t>
+      </w:r>
+    </w:p>
+    <w:p>
+      <w:pPr>
+        <w:pStyle w:val="Bullet"/>
+      </w:pPr>
+      <w:r>
+        <w:t xml:space="preserve">•  </w:t>
+      </w:r>
+      <w:r>
+        <w:rPr>
+          <w:b/>
+        </w:rPr>
+        <w:t xml:space="preserve">Tableau de bord plus rapide (Niveau 0) : </w:t>
+      </w:r>
+      <w:r>
+        <w:t xml:space="preserve">il ne charge plus toute la base avec les CV/lettres ; chargement nettement allégé.</w:t>
+      </w:r>
+    </w:p>
+    <w:p>
+      <w:pPr>
+        <w:pStyle w:val="Bullet"/>
+      </w:pPr>
+      <w:r>
+        <w:t xml:space="preserve">•  </w:t>
+      </w:r>
+      <w:r>
+        <w:rPr>
+          <w:b/>
+        </w:rPr>
+        <w:t xml:space="preserve">Nouvelle colonne experienceYears (Niveau 1) : </w:t>
+      </w:r>
+      <w:r>
+        <w:t xml:space="preserve">années d'expérience stockées dans une vraie colonne indexée (renseignée à l'analyse). Prépare les optimisations à venir. → nécessite une migration (voir partie 4).</w:t>
+      </w:r>
+    </w:p>
+    <w:p>
+      <w:pPr>
+        <w:pStyle w:val="Bullet"/>
+      </w:pPr>
+      <w:r>
+        <w:t xml:space="preserve">•  </w:t>
+      </w:r>
+      <w:r>
+        <w:rPr>
+          <w:b/>
+        </w:rPr>
+        <w:t xml:space="preserve">Base de données — 2 migrations : </w:t>
+      </w:r>
+      <w:r>
+        <w:t xml:space="preserve">add_candidate_experience_years et add_job_soft_skills_required. Additives (colonnes ajoutées), sans perte de données. AUCUNE nouvelle dépendance npm.</w:t>
       </w:r>
     </w:p>
     <w:p>
@@ -156,7 +190,7 @@
         <w:t xml:space="preserve">Prod déjà à jour : </w:t>
       </w:r>
       <w:r>
-        <w:t xml:space="preserve">commit 1420ffb poussé et déployé automatiquement sur Render.</w:t>
+        <w:t xml:space="preserve">dernier commit b0182b5 poussé et déployé automatiquement sur Render (migrations appliquées via migrate deploy).</w:t>
       </w:r>
     </w:p>
     <w:p>
@@ -314,27 +348,123 @@
           <w:rFonts w:ascii="Consolas" w:hAnsi="Consolas"/>
           <w:shd w:val="clear" w:fill="EEF2F7"/>
         </w:rPr>
+        <w:t xml:space="preserve">src/App.tsx</w:t>
+      </w:r>
+    </w:p>
+    <w:p>
+      <w:pPr>
+        <w:pStyle w:val="Code"/>
+      </w:pPr>
+      <w:r>
+        <w:rPr>
+          <w:rFonts w:ascii="Consolas" w:hAnsi="Consolas"/>
+          <w:shd w:val="clear" w:fill="EEF2F7"/>
+        </w:rPr>
+        <w:t xml:space="preserve">src/types.ts</w:t>
+      </w:r>
+    </w:p>
+    <w:p>
+      <w:pPr>
+        <w:pStyle w:val="Code"/>
+      </w:pPr>
+      <w:r>
+        <w:rPr>
+          <w:rFonts w:ascii="Consolas" w:hAnsi="Consolas"/>
+          <w:shd w:val="clear" w:fill="EEF2F7"/>
+        </w:rPr>
+        <w:t xml:space="preserve">src/lib/mappers.ts</w:t>
+      </w:r>
+    </w:p>
+    <w:p>
+      <w:pPr>
+        <w:pStyle w:val="Code"/>
+      </w:pPr>
+      <w:r>
+        <w:rPr>
+          <w:rFonts w:ascii="Consolas" w:hAnsi="Consolas"/>
+          <w:shd w:val="clear" w:fill="EEF2F7"/>
+        </w:rPr>
+        <w:t xml:space="preserve">src/components/Button.tsx  (nouveau)</w:t>
+      </w:r>
+    </w:p>
+    <w:p>
+      <w:pPr>
+        <w:pStyle w:val="Code"/>
+      </w:pPr>
+      <w:r>
+        <w:rPr>
+          <w:rFonts w:ascii="Consolas" w:hAnsi="Consolas"/>
+          <w:shd w:val="clear" w:fill="EEF2F7"/>
+        </w:rPr>
         <w:t xml:space="preserve">src/components/CandidatesView.tsx</w:t>
       </w:r>
     </w:p>
     <w:p>
       <w:pPr>
+        <w:pStyle w:val="Code"/>
+      </w:pPr>
+      <w:r>
+        <w:rPr>
+          <w:rFonts w:ascii="Consolas" w:hAnsi="Consolas"/>
+          <w:shd w:val="clear" w:fill="EEF2F7"/>
+        </w:rPr>
+        <w:t xml:space="preserve">src/components/JobsView.tsx</w:t>
+      </w:r>
+    </w:p>
+    <w:p>
+      <w:pPr>
+        <w:pStyle w:val="Code"/>
+      </w:pPr>
+      <w:r>
+        <w:rPr>
+          <w:rFonts w:ascii="Consolas" w:hAnsi="Consolas"/>
+          <w:shd w:val="clear" w:fill="EEF2F7"/>
+        </w:rPr>
+        <w:t xml:space="preserve">src/components/CandidateProfileView.tsx</w:t>
+      </w:r>
+    </w:p>
+    <w:p>
+      <w:pPr>
         <w:pStyle w:val="Heading2"/>
       </w:pPr>
       <w:r>
-        <w:t xml:space="preserve">Scripts (facultatif — génère le document)</w:t>
-      </w:r>
-    </w:p>
-    <w:p>
-      <w:pPr>
-        <w:pStyle w:val="Code"/>
-      </w:pPr>
-      <w:r>
-        <w:rPr>
-          <w:rFonts w:ascii="Consolas" w:hAnsi="Consolas"/>
-          <w:shd w:val="clear" w:fill="EEF2F7"/>
-        </w:rPr>
-        <w:t xml:space="preserve">scripts/gen-guide-sync-maison-2026-07-17.cjs</w:t>
+        <w:t xml:space="preserve">Base de données (indispensable)</w:t>
+      </w:r>
+    </w:p>
+    <w:p>
+      <w:pPr>
+        <w:pStyle w:val="Code"/>
+      </w:pPr>
+      <w:r>
+        <w:rPr>
+          <w:rFonts w:ascii="Consolas" w:hAnsi="Consolas"/>
+          <w:shd w:val="clear" w:fill="EEF2F7"/>
+        </w:rPr>
+        <w:t xml:space="preserve">prisma/schema.prisma</w:t>
+      </w:r>
+    </w:p>
+    <w:p>
+      <w:pPr>
+        <w:pStyle w:val="Code"/>
+      </w:pPr>
+      <w:r>
+        <w:rPr>
+          <w:rFonts w:ascii="Consolas" w:hAnsi="Consolas"/>
+          <w:shd w:val="clear" w:fill="EEF2F7"/>
+        </w:rPr>
+        <w:t xml:space="preserve">prisma/migrations/20260717120000_add_candidate_experience_years/</w:t>
+      </w:r>
+    </w:p>
+    <w:p>
+      <w:pPr>
+        <w:pStyle w:val="Code"/>
+      </w:pPr>
+      <w:r>
+        <w:rPr>
+          <w:rFonts w:ascii="Consolas" w:hAnsi="Consolas"/>
+          <w:shd w:val="clear" w:fill="EEF2F7"/>
+        </w:rPr>
+        <w:t xml:space="preserve">prisma/migrations/20260716165929_add_job_soft_skills_required/</w:t>
       </w:r>
     </w:p>
     <w:p>
@@ -342,6 +472,38 @@
         <w:pStyle w:val="Heading2"/>
       </w:pPr>
       <w:r>
+        <w:t xml:space="preserve">Scripts (facultatif)</w:t>
+      </w:r>
+    </w:p>
+    <w:p>
+      <w:pPr>
+        <w:pStyle w:val="Code"/>
+      </w:pPr>
+      <w:r>
+        <w:rPr>
+          <w:rFonts w:ascii="Consolas" w:hAnsi="Consolas"/>
+          <w:shd w:val="clear" w:fill="EEF2F7"/>
+        </w:rPr>
+        <w:t xml:space="preserve">scripts/backfill-experience-years.cjs  (backfill experienceYears)</w:t>
+      </w:r>
+    </w:p>
+    <w:p>
+      <w:pPr>
+        <w:pStyle w:val="Code"/>
+      </w:pPr>
+      <w:r>
+        <w:rPr>
+          <w:rFonts w:ascii="Consolas" w:hAnsi="Consolas"/>
+          <w:shd w:val="clear" w:fill="EEF2F7"/>
+        </w:rPr>
+        <w:t xml:space="preserve">scripts/gen-guide-sync-maison-2026-07-17.cjs  (génère ce document)</w:t>
+      </w:r>
+    </w:p>
+    <w:p>
+      <w:pPr>
+        <w:pStyle w:val="Heading2"/>
+      </w:pPr>
+      <w:r>
         <w:t xml:space="preserve">Documentation (facultatif — regénérable via le script)</w:t>
       </w:r>
     </w:p>
@@ -401,7 +563,10 @@
         <w:rPr>
           <w:b/>
         </w:rPr>
-        <w:t xml:space="preserve">Pas de migration, pas de re-seed, pas de nouvelle dépendance aujourd'hui.</w:t>
+        <w:t xml:space="preserve">IMPORTANT cette fois : il y a 2 migrations de base. </w:t>
+      </w:r>
+      <w:r>
+        <w:t xml:space="preserve">Sans elles, l'application plantera en local (colonnes manquantes). Suivez les étapes DANS L'ORDRE.</w:t>
       </w:r>
     </w:p>
     <w:p>
@@ -415,7 +580,31 @@
         <w:t xml:space="preserve">1. </w:t>
       </w:r>
       <w:r>
-        <w:t xml:space="preserve">(Si vous aviez déjà tout installé, cette étape est facultative) Installer les dépendances :</w:t>
+        <w:t xml:space="preserve">ARRÊTER le serveur de dev s'il tourne (fermez le terminal </w:t>
+      </w:r>
+      <w:r>
+        <w:rPr>
+          <w:rFonts w:ascii="Consolas" w:hAnsi="Consolas"/>
+          <w:shd w:val="clear" w:fill="EEF2F7"/>
+        </w:rPr>
+        <w:t xml:space="preserve">npm run dev</w:t>
+      </w:r>
+      <w:r>
+        <w:t xml:space="preserve"> ou Ctrl+C). Sous Windows, Prisma ne peut pas se régénérer tant que le serveur tient le moteur (erreur EPERM).</w:t>
+      </w:r>
+    </w:p>
+    <w:p>
+      <w:pPr>
+        <w:pStyle w:val="Body"/>
+      </w:pPr>
+      <w:r>
+        <w:rPr>
+          <w:b/>
+        </w:rPr>
+        <w:t xml:space="preserve">2. </w:t>
+      </w:r>
+      <w:r>
+        <w:t xml:space="preserve">Installer les dépendances (aucune nouvelle aujourd'hui, mais sans risque) :</w:t>
       </w:r>
     </w:p>
     <w:p>
@@ -438,7 +627,85 @@
         <w:rPr>
           <w:b/>
         </w:rPr>
-        <w:t xml:space="preserve">2. </w:t>
+        <w:t xml:space="preserve">3. </w:t>
+      </w:r>
+      <w:r>
+        <w:t xml:space="preserve">Appliquer les 2 migrations à votre base LOCALE (colonnes experienceYears + softSkillsRequired) :</w:t>
+      </w:r>
+    </w:p>
+    <w:p>
+      <w:pPr>
+        <w:pStyle w:val="Code"/>
+      </w:pPr>
+      <w:r>
+        <w:rPr>
+          <w:rFonts w:ascii="Consolas" w:hAnsi="Consolas"/>
+          <w:shd w:val="clear" w:fill="EEF2F7"/>
+        </w:rPr>
+        <w:t xml:space="preserve">npx prisma migrate deploy</w:t>
+      </w:r>
+    </w:p>
+    <w:p>
+      <w:pPr>
+        <w:pStyle w:val="Body"/>
+      </w:pPr>
+      <w:r>
+        <w:rPr>
+          <w:b/>
+        </w:rPr>
+        <w:t xml:space="preserve">4. </w:t>
+      </w:r>
+      <w:r>
+        <w:t xml:space="preserve">Régénérer le client Prisma (pour que le code reconnaisse les nouvelles colonnes) :</w:t>
+      </w:r>
+    </w:p>
+    <w:p>
+      <w:pPr>
+        <w:pStyle w:val="Code"/>
+      </w:pPr>
+      <w:r>
+        <w:rPr>
+          <w:rFonts w:ascii="Consolas" w:hAnsi="Consolas"/>
+          <w:shd w:val="clear" w:fill="EEF2F7"/>
+        </w:rPr>
+        <w:t xml:space="preserve">npx prisma generate</w:t>
+      </w:r>
+    </w:p>
+    <w:p>
+      <w:pPr>
+        <w:pStyle w:val="Body"/>
+      </w:pPr>
+      <w:r>
+        <w:rPr>
+          <w:b/>
+        </w:rPr>
+        <w:t xml:space="preserve">5. </w:t>
+      </w:r>
+      <w:r>
+        <w:t xml:space="preserve">(Optionnel) Remplir experienceYears pour les candidats DÉJÀ analysés — pas urgent :</w:t>
+      </w:r>
+    </w:p>
+    <w:p>
+      <w:pPr>
+        <w:pStyle w:val="Code"/>
+      </w:pPr>
+      <w:r>
+        <w:rPr>
+          <w:rFonts w:ascii="Consolas" w:hAnsi="Consolas"/>
+          <w:shd w:val="clear" w:fill="EEF2F7"/>
+        </w:rPr>
+        <w:t xml:space="preserve">node scripts/backfill-experience-years.cjs</w:t>
+      </w:r>
+    </w:p>
+    <w:p>
+      <w:pPr>
+        <w:pStyle w:val="Body"/>
+      </w:pPr>
+      <w:r>
+        <w:rPr>
+          <w:b/>
+        </w:rPr>
+        <w:t xml:space="preserve">6. </w:t>
       </w:r>
       <w:r>
         <w:t xml:space="preserve">Vérifier que le projet compile :</w:t>
@@ -464,33 +731,7 @@
         <w:rPr>
           <w:b/>
         </w:rPr>
-        <w:t xml:space="preserve">3. </w:t>
-      </w:r>
-      <w:r>
-        <w:t xml:space="preserve">(Optionnel) Regénérer le guide Word du jour :</w:t>
-      </w:r>
-    </w:p>
-    <w:p>
-      <w:pPr>
-        <w:pStyle w:val="Code"/>
-      </w:pPr>
-      <w:r>
-        <w:rPr>
-          <w:rFonts w:ascii="Consolas" w:hAnsi="Consolas"/>
-          <w:shd w:val="clear" w:fill="EEF2F7"/>
-        </w:rPr>
-        <w:t xml:space="preserve">node scripts/gen-guide-sync-maison-2026-07-17.cjs</w:t>
-      </w:r>
-    </w:p>
-    <w:p>
-      <w:pPr>
-        <w:pStyle w:val="Body"/>
-      </w:pPr>
-      <w:r>
-        <w:rPr>
-          <w:b/>
-        </w:rPr>
-        <w:t xml:space="preserve">4. </w:t>
+        <w:t xml:space="preserve">7. </w:t>
       </w:r>
       <w:r>
         <w:t xml:space="preserve">Relancer le serveur de dev, puis Ctrl+F5 dans le navigateur :</w:t>
@@ -513,6 +754,20 @@
         <w:pStyle w:val="Body"/>
       </w:pPr>
       <w:r>
+        <w:rPr>
+          <w:b/>
+        </w:rPr>
+        <w:t xml:space="preserve">Note : </w:t>
+      </w:r>
+      <w:r>
+        <w:t xml:space="preserve">en production, rien à faire manuellement — Render applique les migrations tout seul (migrate deploy) à chaque push. Ces commandes ne concernent que votre poste maison.</w:t>
+      </w:r>
+    </w:p>
+    <w:p>
+      <w:pPr>
+        <w:pStyle w:val="Body"/>
+      </w:pPr>
+      <w:r>
         <w:t xml:space="preserve"/>
       </w:r>
     </w:p>
@@ -599,41 +854,92 @@
         <w:pStyle w:val="Heading1"/>
       </w:pPr>
       <w:r>
-        <w:t xml:space="preserve">6. Ce dont vous n'avez PAS besoin</w:t>
-      </w:r>
-    </w:p>
-    <w:p>
-      <w:pPr>
-        <w:pStyle w:val="Bullet"/>
-      </w:pPr>
-      <w:r>
-        <w:t xml:space="preserve">•  </w:t>
-      </w:r>
-      <w:r>
-        <w:rPr>
-          <w:b/>
-        </w:rPr>
-        <w:t xml:space="preserve">Pas de prisma migrate / db seed : </w:t>
-      </w:r>
-      <w:r>
-        <w:t xml:space="preserve">aucun champ de base ajouté.</w:t>
-      </w:r>
-    </w:p>
-    <w:p>
-      <w:pPr>
-        <w:pStyle w:val="Bullet"/>
-      </w:pPr>
-      <w:r>
-        <w:t xml:space="preserve">•  </w:t>
-      </w:r>
-      <w:r>
-        <w:rPr>
-          <w:b/>
-        </w:rPr>
-        <w:t xml:space="preserve">Pas de npm install obligatoire : </w:t>
-      </w:r>
-      <w:r>
-        <w:t xml:space="preserve">aucune nouvelle dépendance aujourd'hui (tout réutilise l'existant).</w:t>
+        <w:t xml:space="preserve">6. Ce dont vous avez (et n'avez pas) besoin cette fois</w:t>
+      </w:r>
+    </w:p>
+    <w:p>
+      <w:pPr>
+        <w:pStyle w:val="Bullet"/>
+      </w:pPr>
+      <w:r>
+        <w:t xml:space="preserve">•  </w:t>
+      </w:r>
+      <w:r>
+        <w:rPr>
+          <w:b/>
+        </w:rPr>
+        <w:t xml:space="preserve">Migrations OBLIGATOIRES en local : </w:t>
+      </w:r>
+      <w:r>
+        <w:t xml:space="preserve">les 2 migrations doivent être appliquées (partie 4, étape 3), sinon l'app plante (colonnes manquantes).</w:t>
+      </w:r>
+    </w:p>
+    <w:p>
+      <w:pPr>
+        <w:pStyle w:val="Bullet"/>
+      </w:pPr>
+      <w:r>
+        <w:t xml:space="preserve">•  </w:t>
+      </w:r>
+      <w:r>
+        <w:rPr>
+          <w:b/>
+        </w:rPr>
+        <w:t xml:space="preserve">Régénération Prisma OBLIGATOIRE : </w:t>
+      </w:r>
+      <w:r>
+        <w:t xml:space="preserve">après les migrations (partie 4, étape 4), sinon le code ne « voit » pas les nouvelles colonnes.</w:t>
+      </w:r>
+    </w:p>
+    <w:p>
+      <w:pPr>
+        <w:pStyle w:val="Bullet"/>
+      </w:pPr>
+      <w:r>
+        <w:t xml:space="preserve">•  </w:t>
+      </w:r>
+      <w:r>
+        <w:rPr>
+          <w:b/>
+        </w:rPr>
+        <w:t xml:space="preserve">Pas de re-seed : </w:t>
+      </w:r>
+      <w:r>
+        <w:t xml:space="preserve">les données de démo ne changent pas ; ne lancez pas prisma db seed (il réécrirait les données).</w:t>
+      </w:r>
+    </w:p>
+    <w:p>
+      <w:pPr>
+        <w:pStyle w:val="Bullet"/>
+      </w:pPr>
+      <w:r>
+        <w:t xml:space="preserve">•  </w:t>
+      </w:r>
+      <w:r>
+        <w:rPr>
+          <w:b/>
+        </w:rPr>
+        <w:t xml:space="preserve">Pas de nouvelle dépendance : </w:t>
+      </w:r>
+      <w:r>
+        <w:t xml:space="preserve">npm install n'est pas strictement requis (aucun paquet ajouté).</w:t>
+      </w:r>
+    </w:p>
+    <w:p>
+      <w:pPr>
+        <w:pStyle w:val="Bullet"/>
+      </w:pPr>
+      <w:r>
+        <w:t xml:space="preserve">•  </w:t>
+      </w:r>
+      <w:r>
+        <w:rPr>
+          <w:b/>
+        </w:rPr>
+        <w:t xml:space="preserve">Backfill facultatif : </w:t>
+      </w:r>
+      <w:r>
+        <w:t xml:space="preserve">experienceYears se remplit automatiquement aux prochaines analyses ; le script ne sert qu'à rattraper les candidats déjà analysés.</w:t>
       </w:r>
     </w:p>
     <w:p>
@@ -650,7 +956,7 @@
         <w:t xml:space="preserve">Rien à faire côté production : </w:t>
       </w:r>
       <w:r>
-        <w:t xml:space="preserve">Render redéploie automatiquement à chaque push.</w:t>
+        <w:t xml:space="preserve">Render redéploie et applique les migrations automatiquement à chaque push.</w:t>
       </w:r>
     </w:p>
     <w:p>
@@ -680,61 +986,95 @@
         <w:rPr>
           <w:b/>
         </w:rPr>
-        <w:t xml:space="preserve">Onglet Candidats → Ajouter un candidat : </w:t>
-      </w:r>
-      <w:r>
-        <w:t xml:space="preserve">au-dessus des champs CV et Lettre de motivation, un bouton « Importer » est visible.</w:t>
-      </w:r>
-    </w:p>
-    <w:p>
-      <w:pPr>
-        <w:pStyle w:val="Bullet"/>
-      </w:pPr>
-      <w:r>
-        <w:t xml:space="preserve">•  </w:t>
-      </w:r>
-      <w:r>
-        <w:rPr>
-          <w:b/>
-        </w:rPr>
-        <w:t xml:space="preserve">Import CV : </w:t>
-      </w:r>
-      <w:r>
-        <w:t xml:space="preserve">cliquer « Importer (PDF ou image) », choisir un PDF ou une photo/scan de CV → le texte apparaît dans le champ CV.</w:t>
-      </w:r>
-    </w:p>
-    <w:p>
-      <w:pPr>
-        <w:pStyle w:val="Bullet"/>
-      </w:pPr>
-      <w:r>
-        <w:t xml:space="preserve">•  </w:t>
-      </w:r>
-      <w:r>
-        <w:rPr>
-          <w:b/>
-        </w:rPr>
-        <w:t xml:space="preserve">Import lettre : </w:t>
-      </w:r>
-      <w:r>
-        <w:t xml:space="preserve">cliquer « Importer (PDF ou Word) », choisir un PDF ou un .docx → le texte apparaît dans le champ Lettre.</w:t>
-      </w:r>
-    </w:p>
-    <w:p>
-      <w:pPr>
-        <w:pStyle w:val="Bullet"/>
-      </w:pPr>
-      <w:r>
-        <w:t xml:space="preserve">•  </w:t>
-      </w:r>
-      <w:r>
-        <w:rPr>
-          <w:b/>
-        </w:rPr>
-        <w:t xml:space="preserve">Format refusé : </w:t>
-      </w:r>
-      <w:r>
-        <w:t xml:space="preserve">choisir un mauvais format (ex. une image pour la lettre) affiche un message d'erreur clair, sans bloquer le reste du formulaire.</w:t>
+        <w:t xml:space="preserve">Listes non vides : </w:t>
+      </w:r>
+      <w:r>
+        <w:t xml:space="preserve">après les migrations et le redémarrage, les candidats et les offres s'affichent normalement (si vide, c'est souvent que les migrations n'ont pas été appliquées).</w:t>
+      </w:r>
+    </w:p>
+    <w:p>
+      <w:pPr>
+        <w:pStyle w:val="Bullet"/>
+      </w:pPr>
+      <w:r>
+        <w:t xml:space="preserve">•  </w:t>
+      </w:r>
+      <w:r>
+        <w:rPr>
+          <w:b/>
+        </w:rPr>
+        <w:t xml:space="preserve">Offre — soft skills : </w:t>
+      </w:r>
+      <w:r>
+        <w:t xml:space="preserve">créez/éditez une offre, ajoutez des soft skills (ex. « Communication, Rigueur ») → ils apparaissent en badges NOIRS dans la liste des offres et dans le détail.</w:t>
+      </w:r>
+    </w:p>
+    <w:p>
+      <w:pPr>
+        <w:pStyle w:val="Bullet"/>
+      </w:pPr>
+      <w:r>
+        <w:t xml:space="preserve">•  </w:t>
+      </w:r>
+      <w:r>
+        <w:rPr>
+          <w:b/>
+        </w:rPr>
+        <w:t xml:space="preserve">Candidat — soft skills : </w:t>
+      </w:r>
+      <w:r>
+        <w:t xml:space="preserve">ouvrez une fiche déjà analysée → onglet Analyse IA → le bloc « Savoir-être (soft skills) » est présent (si le candidat en a).</w:t>
+      </w:r>
+    </w:p>
+    <w:p>
+      <w:pPr>
+        <w:pStyle w:val="Bullet"/>
+      </w:pPr>
+      <w:r>
+        <w:t xml:space="preserve">•  </w:t>
+      </w:r>
+      <w:r>
+        <w:rPr>
+          <w:b/>
+        </w:rPr>
+        <w:t xml:space="preserve">Recherche candidats : </w:t>
+      </w:r>
+      <w:r>
+        <w:t xml:space="preserve">tapez le nom d'un candidat situé sur une autre page → il est trouvé (recherche sur toute la base).</w:t>
+      </w:r>
+    </w:p>
+    <w:p>
+      <w:pPr>
+        <w:pStyle w:val="Bullet"/>
+      </w:pPr>
+      <w:r>
+        <w:t xml:space="preserve">•  </w:t>
+      </w:r>
+      <w:r>
+        <w:rPr>
+          <w:b/>
+        </w:rPr>
+        <w:t xml:space="preserve">Import CV / lettre : </w:t>
+      </w:r>
+      <w:r>
+        <w:t xml:space="preserve">« Ajouter un candidat » → boutons « Importer » au-dessus des champs CV et Lettre.</w:t>
+      </w:r>
+    </w:p>
+    <w:p>
+      <w:pPr>
+        <w:pStyle w:val="Bullet"/>
+      </w:pPr>
+      <w:r>
+        <w:t xml:space="preserve">•  </w:t>
+      </w:r>
+      <w:r>
+        <w:rPr>
+          <w:b/>
+        </w:rPr>
+        <w:t xml:space="preserve">Tableau de bord : </w:t>
+      </w:r>
+      <w:r>
+        <w:t xml:space="preserve">se charge rapidement (plus de chargement de toute la base).</w:t>
       </w:r>
     </w:p>
     <w:p>
@@ -764,61 +1104,95 @@
         <w:rPr>
           <w:b/>
         </w:rPr>
-        <w:t xml:space="preserve">Formats CV acceptés à l'ajout : </w:t>
-      </w:r>
-      <w:r>
-        <w:t xml:space="preserve">PDF et images JPG / PNG / WebP.</w:t>
-      </w:r>
-    </w:p>
-    <w:p>
-      <w:pPr>
-        <w:pStyle w:val="Bullet"/>
-      </w:pPr>
-      <w:r>
-        <w:t xml:space="preserve">•  </w:t>
-      </w:r>
-      <w:r>
-        <w:rPr>
-          <w:b/>
-        </w:rPr>
-        <w:t xml:space="preserve">Formats lettre acceptés à l'ajout : </w:t>
-      </w:r>
-      <w:r>
-        <w:t xml:space="preserve">PDF et Word .docx.</w:t>
-      </w:r>
-    </w:p>
-    <w:p>
-      <w:pPr>
-        <w:pStyle w:val="Bullet"/>
-      </w:pPr>
-      <w:r>
-        <w:t xml:space="preserve">•  </w:t>
-      </w:r>
-      <w:r>
-        <w:rPr>
-          <w:b/>
-        </w:rPr>
-        <w:t xml:space="preserve">OCR d'image : </w:t>
-      </w:r>
-      <w:r>
-        <w:t xml:space="preserve">ajoute quelques secondes au traitement (~10-15 s) et consomme du quota Gemini ; une image nette donne une meilleure extraction.</w:t>
-      </w:r>
-    </w:p>
-    <w:p>
-      <w:pPr>
-        <w:pStyle w:val="Bullet"/>
-      </w:pPr>
-      <w:r>
-        <w:t xml:space="preserve">•  </w:t>
-      </w:r>
-      <w:r>
-        <w:rPr>
-          <w:b/>
-        </w:rPr>
-        <w:t xml:space="preserve">Uploads : </w:t>
-      </w:r>
-      <w:r>
-        <w:t xml:space="preserve">le fichier est traité en mémoire (aucune écriture disque) : seul le texte extrait est conservé.</w:t>
+        <w:t xml:space="preserve">Migrations additives : </w:t>
+      </w:r>
+      <w:r>
+        <w:t xml:space="preserve">les 2 migrations ne font qu'AJOUTER des colonnes (experienceYears sur les candidats, softSkillsRequired sur les offres) — aucune donnée existante n'est modifiée ou supprimée.</w:t>
+      </w:r>
+    </w:p>
+    <w:p>
+      <w:pPr>
+        <w:pStyle w:val="Bullet"/>
+      </w:pPr>
+      <w:r>
+        <w:t xml:space="preserve">•  </w:t>
+      </w:r>
+      <w:r>
+        <w:rPr>
+          <w:b/>
+        </w:rPr>
+        <w:t xml:space="preserve">Soft skills des offres existantes : </w:t>
+      </w:r>
+      <w:r>
+        <w:t xml:space="preserve">elles démarrent sans soft skills (champ vide) ; éditez une offre pour en ajouter.</w:t>
+      </w:r>
+    </w:p>
+    <w:p>
+      <w:pPr>
+        <w:pStyle w:val="Bullet"/>
+      </w:pPr>
+      <w:r>
+        <w:t xml:space="preserve">•  </w:t>
+      </w:r>
+      <w:r>
+        <w:rPr>
+          <w:b/>
+        </w:rPr>
+        <w:t xml:space="preserve">Soft skills du candidat : </w:t>
+      </w:r>
+      <w:r>
+        <w:t xml:space="preserve">s'affichent pour les fiches déjà analysées si l'IA en avait extrait ; sinon relancez « Analyser avec l'IA ».</w:t>
+      </w:r>
+    </w:p>
+    <w:p>
+      <w:pPr>
+        <w:pStyle w:val="Bullet"/>
+      </w:pPr>
+      <w:r>
+        <w:t xml:space="preserve">•  </w:t>
+      </w:r>
+      <w:r>
+        <w:rPr>
+          <w:b/>
+        </w:rPr>
+        <w:t xml:space="preserve">experienceYears : </w:t>
+      </w:r>
+      <w:r>
+        <w:t xml:space="preserve">aucune fonctionnalité visible ne la lit encore ; c'est une base pour de futures optimisations (filtre par expérience côté serveur, tableau de bord).</w:t>
+      </w:r>
+    </w:p>
+    <w:p>
+      <w:pPr>
+        <w:pStyle w:val="Bullet"/>
+      </w:pPr>
+      <w:r>
+        <w:t xml:space="preserve">•  </w:t>
+      </w:r>
+      <w:r>
+        <w:rPr>
+          <w:b/>
+        </w:rPr>
+        <w:t xml:space="preserve">Formats d'import : </w:t>
+      </w:r>
+      <w:r>
+        <w:t xml:space="preserve">CV = PDF ou image (JPG/PNG/WebP, OCR Gemini) ; Lettre = PDF ou Word (.docx). L'OCR image nécessite GEMINI_API_KEY (voir partie 5).</w:t>
+      </w:r>
+    </w:p>
+    <w:p>
+      <w:pPr>
+        <w:pStyle w:val="Bullet"/>
+      </w:pPr>
+      <w:r>
+        <w:t xml:space="preserve">•  </w:t>
+      </w:r>
+      <w:r>
+        <w:rPr>
+          <w:b/>
+        </w:rPr>
+        <w:t xml:space="preserve">Piège Windows (rappel) : </w:t>
+      </w:r>
+      <w:r>
+        <w:t xml:space="preserve">toujours arrêter npm run dev avant prisma migrate / generate (verrou du moteur, erreur EPERM).</w:t>
       </w:r>
     </w:p>
     <w:p>

</xml_diff>

<commit_message>
docs: maj recap + guide - badges soft skills candidat en noir/blanc
Co-Authored-By: Claude Opus 4.8 <noreply@anthropic.com>
</commit_message>
<xml_diff>
--- a/Guide-Sync-Maison-2026-07-17.docx
+++ b/Guide-Sync-Maison-2026-07-17.docx
@@ -88,7 +88,7 @@
         <w:t xml:space="preserve">Soft skills sur la fiche candidat : </w:t>
       </w:r>
       <w:r>
-        <w:t xml:space="preserve">nouveau bloc « Savoir-être (soft skills) » dans l'onglet Analyse IA (ces compétences étaient extraites par l'IA mais jamais affichées).</w:t>
+        <w:t xml:space="preserve">nouveau bloc « Savoir-être (soft skills) » dans l'onglet Analyse IA, en badges fond noir / texte blanc (ces compétences étaient extraites par l'IA mais jamais affichées).</w:t>
       </w:r>
     </w:p>
     <w:p>
@@ -1023,7 +1023,7 @@
         <w:t xml:space="preserve">Candidat — soft skills : </w:t>
       </w:r>
       <w:r>
-        <w:t xml:space="preserve">ouvrez une fiche déjà analysée → onglet Analyse IA → le bloc « Savoir-être (soft skills) » est présent (si le candidat en a).</w:t>
+        <w:t xml:space="preserve">ouvrez une fiche déjà analysée → onglet Analyse IA → le bloc « Savoir-être (soft skills) » s'affiche en badges NOIRS (si le candidat en a).</w:t>
       </w:r>
     </w:p>
     <w:p>

</xml_diff>

<commit_message>
feat(server): filet de securite global anti-crash (+ maj recap/guide)
- process.on unhandledRejection/uncaughtException : loguent sans quitter
  (une erreur async non capturee ne tue plus le process entier).
- Middleware d'erreur Express (ErrorRequestHandler) enregistre en dernier :
  500 JSON propre au lieu d'une page HTML.
- Aucun changement fonctionnel, aucune migration, aucune dependance.

Co-Authored-By: Claude Opus 4.8 <noreply@anthropic.com>
</commit_message>
<xml_diff>
--- a/Guide-Sync-Maison-2026-07-17.docx
+++ b/Guide-Sync-Maison-2026-07-17.docx
@@ -157,6 +157,23 @@
       </w:r>
       <w:r>
         <w:t xml:space="preserve">années d'expérience stockées dans une vraie colonne indexée (renseignée à l'analyse). Prépare les optimisations à venir. → nécessite une migration (voir partie 4).</w:t>
+      </w:r>
+    </w:p>
+    <w:p>
+      <w:pPr>
+        <w:pStyle w:val="Bullet"/>
+      </w:pPr>
+      <w:r>
+        <w:t xml:space="preserve">•  </w:t>
+      </w:r>
+      <w:r>
+        <w:rPr>
+          <w:b/>
+        </w:rPr>
+        <w:t xml:space="preserve">Filet de sécurité anti-crash : </w:t>
+      </w:r>
+      <w:r>
+        <w:t xml:space="preserve">le serveur logue désormais les erreurs imprévues sans s'arrêter (avant, une seule erreur non gérée pouvait faire tomber tout le serveur). Aucun impact visible, juste plus robuste.</w:t>
       </w:r>
     </w:p>
     <w:p>

</xml_diff>

<commit_message>
docs: recap + guide - Niveau 2 (top competences SQL) et backfills dans le seed
Co-Authored-By: Claude Opus 4.8 <noreply@anthropic.com>
</commit_message>
<xml_diff>
--- a/Guide-Sync-Maison-2026-07-17.docx
+++ b/Guide-Sync-Maison-2026-07-17.docx
@@ -156,7 +156,24 @@
         <w:t xml:space="preserve">Nouvelle colonne experienceYears (Niveau 1) : </w:t>
       </w:r>
       <w:r>
-        <w:t xml:space="preserve">années d'expérience stockées dans une vraie colonne indexée (renseignée à l'analyse). Prépare les optimisations à venir. → nécessite une migration (voir partie 4).</w:t>
+        <w:t xml:space="preserve">années d'expérience stockées dans une vraie colonne indexée (renseignée à l'analyse). → nécessite une migration (voir partie 4).</w:t>
+      </w:r>
+    </w:p>
+    <w:p>
+      <w:pPr>
+        <w:pStyle w:val="Bullet"/>
+      </w:pPr>
+      <w:r>
+        <w:t xml:space="preserve">•  </w:t>
+      </w:r>
+      <w:r>
+        <w:rPr>
+          <w:b/>
+        </w:rPr>
+        <w:t xml:space="preserve">Tableau de bord encore plus efficace (Niveau 2) : </w:t>
+      </w:r>
+      <w:r>
+        <w:t xml:space="preserve">il ne « charge plus toute la base » ; le top compétences et la répartition par expérience sont calculés directement par la base de données (SQL). À l'analyse, les compétences sont enregistrées dans une table dédiée. Aucune migration, aucune nouvelle dépendance.</w:t>
       </w:r>
     </w:p>
     <w:p>
@@ -469,6 +486,18 @@
           <w:rFonts w:ascii="Consolas" w:hAnsi="Consolas"/>
           <w:shd w:val="clear" w:fill="EEF2F7"/>
         </w:rPr>
+        <w:t xml:space="preserve">prisma/seed.ts  (backfills automatiques Niveau 1 + 2)</w:t>
+      </w:r>
+    </w:p>
+    <w:p>
+      <w:pPr>
+        <w:pStyle w:val="Code"/>
+      </w:pPr>
+      <w:r>
+        <w:rPr>
+          <w:rFonts w:ascii="Consolas" w:hAnsi="Consolas"/>
+          <w:shd w:val="clear" w:fill="EEF2F7"/>
+        </w:rPr>
         <w:t xml:space="preserve">prisma/migrations/20260717120000_add_candidate_experience_years/</w:t>
       </w:r>
     </w:p>
@@ -513,6 +542,18 @@
           <w:rFonts w:ascii="Consolas" w:hAnsi="Consolas"/>
           <w:shd w:val="clear" w:fill="EEF2F7"/>
         </w:rPr>
+        <w:t xml:space="preserve">scripts/backfill-candidate-skills.cjs  (backfill compétences)</w:t>
+      </w:r>
+    </w:p>
+    <w:p>
+      <w:pPr>
+        <w:pStyle w:val="Code"/>
+      </w:pPr>
+      <w:r>
+        <w:rPr>
+          <w:rFonts w:ascii="Consolas" w:hAnsi="Consolas"/>
+          <w:shd w:val="clear" w:fill="EEF2F7"/>
+        </w:rPr>
         <w:t xml:space="preserve">scripts/gen-guide-sync-maison-2026-07-17.cjs  (génère ce document)</w:t>
       </w:r>
     </w:p>
@@ -699,7 +740,7 @@
         <w:t xml:space="preserve">5. </w:t>
       </w:r>
       <w:r>
-        <w:t xml:space="preserve">(Optionnel) Remplir experienceYears pour les candidats DÉJÀ analysés — pas urgent :</w:t>
+        <w:t xml:space="preserve">Remplir les données des candidats DÉJÀ analysés (années d'expérience + compétences) — utile pour que les graphiques du tableau de bord soient corrects sur l'existant :</w:t>
       </w:r>
     </w:p>
     <w:p>
@@ -716,6 +757,32 @@
     </w:p>
     <w:p>
       <w:pPr>
+        <w:pStyle w:val="Code"/>
+      </w:pPr>
+      <w:r>
+        <w:rPr>
+          <w:rFonts w:ascii="Consolas" w:hAnsi="Consolas"/>
+          <w:shd w:val="clear" w:fill="EEF2F7"/>
+        </w:rPr>
+        <w:t xml:space="preserve">node scripts/backfill-candidate-skills.cjs</w:t>
+      </w:r>
+    </w:p>
+    <w:p>
+      <w:pPr>
+        <w:pStyle w:val="Body"/>
+      </w:pPr>
+      <w:r>
+        <w:rPr>
+          <w:b/>
+        </w:rPr>
+        <w:t xml:space="preserve">En production, inutile de le faire à la main : </w:t>
+      </w:r>
+      <w:r>
+        <w:t xml:space="preserve">ces deux backfills sont intégrés au seed, que Render lance automatiquement à chaque déploiement (idempotents, sans risque à répéter).</w:t>
+      </w:r>
+    </w:p>
+    <w:p>
+      <w:pPr>
         <w:pStyle w:val="Body"/>
       </w:pPr>
       <w:r>
@@ -1172,10 +1239,10 @@
         <w:rPr>
           <w:b/>
         </w:rPr>
-        <w:t xml:space="preserve">experienceYears : </w:t>
-      </w:r>
-      <w:r>
-        <w:t xml:space="preserve">aucune fonctionnalité visible ne la lit encore ; c'est une base pour de futures optimisations (filtre par expérience côté serveur, tableau de bord).</w:t>
+        <w:t xml:space="preserve">experienceYears + compétences normalisées : </w:t>
+      </w:r>
+      <w:r>
+        <w:t xml:space="preserve">désormais utilisées par le tableau de bord (répartition expérience + top compétences calculés en base). D'où l'intérêt des backfills (partie 4, étape 5) pour l'existant.</w:t>
       </w:r>
     </w:p>
     <w:p>

</xml_diff>

<commit_message>
perf(ai-search): Option A - pre-filtre SQL puis rerank IA (borne le prompt)
- /api/candidates/ai-search : ne charge/n'envoie plus toute la base au modele.
  Retrieve SQL (mots-cles -> CandidateSkill / name / location, max 80, tries par
  score, complete par les mieux notes) puis rerank IA sur cette pre-selection.
- Parsing de la reponse Gemini rendu robuste (nettoyage ```json + extraction
  objet + fallback resultat vide) au lieu d'un JSON.parse brut qui faisait 500.
- Aucune migration, aucune dependance. Teste end-to-end (3 requetes).
- Docs : recap + guide synchro maison mis a jour.

Co-Authored-By: Claude Opus 4.8 <noreply@anthropic.com>
</commit_message>
<xml_diff>
--- a/Guide-Sync-Maison-2026-07-17.docx
+++ b/Guide-Sync-Maison-2026-07-17.docx
@@ -174,6 +174,23 @@
       </w:r>
       <w:r>
         <w:t xml:space="preserve">il ne « charge plus toute la base » ; le top compétences et la répartition par expérience sont calculés directement par la base de données (SQL). À l'analyse, les compétences sont enregistrées dans une table dédiée. Aucune migration, aucune nouvelle dépendance.</w:t>
+      </w:r>
+    </w:p>
+    <w:p>
+      <w:pPr>
+        <w:pStyle w:val="Bullet"/>
+      </w:pPr>
+      <w:r>
+        <w:t xml:space="preserve">•  </w:t>
+      </w:r>
+      <w:r>
+        <w:rPr>
+          <w:b/>
+        </w:rPr>
+        <w:t xml:space="preserve">Recherche IA qui tient la charge : </w:t>
+      </w:r>
+      <w:r>
+        <w:t xml:space="preserve">elle ne transmet plus TOUS les candidats à l'IA (ça aurait fini par dépasser ses limites). Elle pré-sélectionne d'abord en base (par compétences / nom / lieu, max 80) puis ne fait affiner que cette liste par l'IA. Plus robuste aussi : une réponse IA imparfaite n'affiche plus d'erreur. Changement de code seul, aucune commande spéciale.</w:t>
       </w:r>
     </w:p>
     <w:p>

</xml_diff>

<commit_message>
docs: recap + guide + manuel (generation offre IA, robustesse IA, page /postuler)
Co-Authored-By: Claude Opus 4.8 <noreply@anthropic.com>
</commit_message>
<xml_diff>
--- a/Guide-Sync-Maison-2026-07-17.docx
+++ b/Guide-Sync-Maison-2026-07-17.docx
@@ -191,6 +191,57 @@
       </w:r>
       <w:r>
         <w:t xml:space="preserve">elle ne transmet plus TOUS les candidats à l'IA (ça aurait fini par dépasser ses limites). Elle pré-sélectionne d'abord en base (par compétences / nom / lieu, max 80) puis ne fait affiner que cette liste par l'IA. Plus robuste aussi : une réponse IA imparfaite n'affiche plus d'erreur. Changement de code seul, aucune commande spéciale.</w:t>
+      </w:r>
+    </w:p>
+    <w:p>
+      <w:pPr>
+        <w:pStyle w:val="Bullet"/>
+      </w:pPr>
+      <w:r>
+        <w:t xml:space="preserve">•  </w:t>
+      </w:r>
+      <w:r>
+        <w:rPr>
+          <w:b/>
+        </w:rPr>
+        <w:t xml:space="preserve">Génération d'offre par l'IA : </w:t>
+      </w:r>
+      <w:r>
+        <w:t xml:space="preserve">dans « Nouvelle Offre », un bouton « Générer avec l'IA » rédige toute l'offre (description, missions, compétences, soft skills, langues, formation, expérience, contrat) à partir du seul intitulé. Tout reste modifiable avant publication. Réutilise Gemini, aucune nouvelle dépendance.</w:t>
+      </w:r>
+    </w:p>
+    <w:p>
+      <w:pPr>
+        <w:pStyle w:val="Bullet"/>
+      </w:pPr>
+      <w:r>
+        <w:t xml:space="preserve">•  </w:t>
+      </w:r>
+      <w:r>
+        <w:rPr>
+          <w:b/>
+        </w:rPr>
+        <w:t xml:space="preserve">Messages d'erreur IA plus clairs : </w:t>
+      </w:r>
+      <w:r>
+        <w:t xml:space="preserve">quand le service IA est momentanément saturé ou que le quota est atteint (fréquent sur le plan gratuit), un message explicite invite à réessayer, au lieu d'une erreur générique.</w:t>
+      </w:r>
+    </w:p>
+    <w:p>
+      <w:pPr>
+        <w:pStyle w:val="Bullet"/>
+      </w:pPr>
+      <w:r>
+        <w:t xml:space="preserve">•  </w:t>
+      </w:r>
+      <w:r>
+        <w:rPr>
+          <w:b/>
+        </w:rPr>
+        <w:t xml:space="preserve">Page /postuler retravaillée : </w:t>
+      </w:r>
+      <w:r>
+        <w:t xml:space="preserve">formulaire plus large, champs regroupés 2 par 2 (Nom/Email, Téléphone/Localisation), et suppression de la barre de défilement horizontale qui apparaissait en bas.</w:t>
       </w:r>
     </w:p>
     <w:p>

</xml_diff>

<commit_message>
docs: recap + guide - fix chargement infini sur mutation en erreur
Co-Authored-By: Claude Opus 4.8 <noreply@anthropic.com>
</commit_message>
<xml_diff>
--- a/Guide-Sync-Maison-2026-07-17.docx
+++ b/Guide-Sync-Maison-2026-07-17.docx
@@ -18,7 +18,7 @@
         <w:t xml:space="preserve">Ce qui a changé aujourd'hui, comment le récupérer chez vous (2 méthodes) et les commandes à lancer. Généré le </w:t>
       </w:r>
       <w:r>
-        <w:t xml:space="preserve">16/07/2026</w:t>
+        <w:t xml:space="preserve">17/07/2026</w:t>
       </w:r>
       <w:r>
         <w:t xml:space="preserve">.</w:t>
@@ -242,6 +242,23 @@
       </w:r>
       <w:r>
         <w:t xml:space="preserve">formulaire plus large, champs regroupés 2 par 2 (Nom/Email, Téléphone/Localisation), et suppression de la barre de défilement horizontale qui apparaissait en bas.</w:t>
+      </w:r>
+    </w:p>
+    <w:p>
+      <w:pPr>
+        <w:pStyle w:val="Bullet"/>
+      </w:pPr>
+      <w:r>
+        <w:t xml:space="preserve">•  </w:t>
+      </w:r>
+      <w:r>
+        <w:rPr>
+          <w:b/>
+        </w:rPr>
+        <w:t xml:space="preserve">Fix — plus de chargement infini : </w:t>
+      </w:r>
+      <w:r>
+        <w:t xml:space="preserve">si l'enregistrement d'une offre ou l'ajout d'un candidat échoue (hoquet passager du plan gratuit), l'onglet ne tourne plus indéfiniment : un message clair invite à réessayer. À noter : enregistrer une offre ne consomme pas de quota IA (seule la génération/analyse/recherche IA en utilise).</w:t>
       </w:r>
     </w:p>
     <w:p>

</xml_diff>